<commit_message>
Fix deliverable: accurate description of test agent vs live OpenClaw
</commit_message>
<xml_diff>
--- a/deliverable.docx
+++ b/deliverable.docx
@@ -34,7 +34,6 @@
       <w:r>
         <w:rPr>
           <w:b/>
-          <w:color w:val="000000"/>
           <w:sz w:val="28"/>
         </w:rPr>
         <w:t>1. Topic and Why It Matters</w:t>
@@ -80,7 +79,6 @@
       <w:r>
         <w:rPr>
           <w:b/>
-          <w:color w:val="000000"/>
           <w:sz w:val="28"/>
         </w:rPr>
         <w:t>2. Existing Landscape</w:t>
@@ -243,10 +241,9 @@
       <w:r>
         <w:rPr>
           <w:b/>
-          <w:color w:val="000000"/>
           <w:sz w:val="28"/>
         </w:rPr>
-        <w:t>3. Framework Run Locally: OpenClaw</w:t>
+        <w:t>3. Framework Studied Locally: OpenClaw + Custom Test Agent</w:t>
       </w:r>
     </w:p>
     <w:p>
@@ -257,7 +254,7 @@
         <w:rPr>
           <w:sz w:val="22"/>
         </w:rPr>
-        <w:t>I deployed OpenClaw on a DigitalOcean droplet and connected it to WhatsApp. The setup took about twenty minutes: clone the repo, fill in openclaw.json with my OpenAI credentials, scan a QR code. From that point I could send a WhatsApp message and have the agent browse the web, run shell commands, or look up information on my behalf.</w:t>
+        <w:t>I studied OpenClaw — an open-source, model-agnostic agent framework that runs as a persistent daemon and connects to messaging platforms including WhatsApp. The architecture is well-suited to analysis: all LLM calls route through a central Gateway configured in openclaw.json, which means a proxy layer can intercept every API call without touching the agent code itself.</w:t>
       </w:r>
     </w:p>
     <w:p>
@@ -268,7 +265,7 @@
         <w:rPr>
           <w:sz w:val="22"/>
         </w:rPr>
-        <w:t>The test task I used was finding the best twenty flat rentals in NYC under $3,000 a month. OpenClaw searched multiple listing sites, filtered results, and returned a ranked list. It worked. But watching the API calls go by in the logs, the inefficiency was immediately visible: GPT-4o was being used to classify a task as complex — a call that consumed 52 tokens and produced a single word. The same progress-check prompt was repeated four times in a row. A search that had already run was triggered again with a slightly different query string.</w:t>
+        <w:t>To generate a controlled execution trace for analysis, I built a test agent modelled on OpenClaw's architecture and tool-calling patterns. The agent's task was to find the best twenty flat rentals in NYC under $3,000 a month, using simulated versions of the same tools OpenClaw would use in production: multi-site listing searches, filtering, detail retrieval, and ranking. I deliberately included the kinds of inefficiencies that are common in real agent deployments: a model-selection call using GPT-4o for a 52-token classification that produces a single word, a progress-check prompt repeated four times consecutively, and a redundant search triggered with a marginally different query string.</w:t>
       </w:r>
     </w:p>
     <w:p>
@@ -279,7 +276,7 @@
         <w:rPr>
           <w:sz w:val="22"/>
         </w:rPr>
-        <w:t>None of this broke the task. But it made the run roughly six times more expensive than it needed to be.</w:t>
+        <w:t>Running this agent through the Agentimize proxy and analysing the trace, the optimiser identified that the run was approximately six times more expensive than necessary. Switching simple calls to GPT-4o-mini and capping the repeated loop at two iterations reduced projected cost by 94% with no change to the final output.</w:t>
       </w:r>
     </w:p>
     <w:p>
@@ -289,7 +286,6 @@
       <w:r>
         <w:rPr>
           <w:b/>
-          <w:color w:val="000000"/>
           <w:sz w:val="28"/>
         </w:rPr>
         <w:t>4. What I Learned</w:t>
@@ -315,7 +311,7 @@
         <w:rPr>
           <w:sz w:val="22"/>
         </w:rPr>
-        <w:t>OpenClaw's model-agnostic Gateway made it straightforward to intercept all API traffic by pointing the base URL at a local proxy. No code changes were needed inside the agent. This validated the core Agentimize architecture: a transparent HTTP proxy that logs every LLM call, builds a workflow graph, and runs a cost optimiser on top.</w:t>
+        <w:t>OpenClaw's Gateway design validated the core Agentimize architecture. Pointing the base URL at a local proxy requires a single config change and captures all LLM traffic transparently. The greedy optimiser — classifying each call by complexity and assigning the cheapest viable model tier — is simple to implement and produces significant savings on realistic traces. The approach generalises to any framework that uses an OpenAI-compatible API, which is essentially all of them.</w:t>
       </w:r>
     </w:p>
     <w:p>
@@ -338,7 +334,7 @@
         <w:rPr>
           <w:sz w:val="22"/>
         </w:rPr>
-        <w:t>OpenClaw's documentation on custom skill configuration is sparse, and the distinction between its Gateway routing logic and the individual channel adapters takes a while to untangle. More broadly, there is no standard schema for what an agent execution trace should contain — every framework logs differently, which makes building a universal optimiser harder than it looks.</w:t>
+        <w:t>There is no standard schema for what an agent execution trace should contain. Every framework logs differently, which makes building a universal optimiser harder than it looks. Deciding what counts as a complex call — and therefore which calls should never be downgraded — required more thought than expected. Token count is a reasonable proxy but not a perfect one.</w:t>
       </w:r>
     </w:p>
     <w:p>
@@ -363,7 +359,7 @@
         <w:rPr>
           <w:sz w:val="22"/>
         </w:rPr>
-        <w:t>The proxy approach captures LLM calls but misses tool execution time (web requests, shell commands) unless the agent logs those separately.</w:t>
+        <w:t>The proxy captures LLM calls but misses tool execution time unless the agent logs those separately.</w:t>
       </w:r>
     </w:p>
     <w:p>
@@ -376,7 +372,7 @@
         <w:rPr>
           <w:sz w:val="22"/>
         </w:rPr>
-        <w:t>Classifying a call as simple or complex based on token count is a heuristic. It works well in practice but will occasionally recommend a model downgrade for a call that genuinely needed the more capable model.</w:t>
+        <w:t>Complexity classification by token count is a heuristic. It works well in practice but will occasionally recommend a model downgrade for a call that genuinely needed the more capable model.</w:t>
       </w:r>
     </w:p>
     <w:p>
@@ -389,7 +385,7 @@
         <w:rPr>
           <w:sz w:val="22"/>
         </w:rPr>
-        <w:t>The greedy optimiser assumes each call is independent. In reality, the output of one call feeds into the next, so swapping a model mid-trace can shift downstream quality in ways that are hard to predict without running the agent again.</w:t>
+        <w:t>The greedy optimiser treats each call as independent. In reality, the output of one call feeds into the next, so swapping a model mid-trace can shift downstream quality in ways that are hard to predict without re-running the agent.</w:t>
       </w:r>
     </w:p>
     <w:p>
@@ -402,7 +398,7 @@
         <w:rPr>
           <w:sz w:val="22"/>
         </w:rPr>
-        <w:t>OpenAI rate limits (10k TPM on the free tier) interrupted test runs repeatedly, which slowed iteration.</w:t>
+        <w:t>Vercel's serverless environment works well for the stateless optimisation endpoint but cannot host the local proxy or persist trace files — the full tool still needs to run locally.</w:t>
       </w:r>
     </w:p>
     <w:p>
@@ -412,7 +408,6 @@
       <w:r>
         <w:rPr>
           <w:b/>
-          <w:color w:val="000000"/>
           <w:sz w:val="28"/>
         </w:rPr>
         <w:t>5. Why This Area Interests Me</w:t>
@@ -437,7 +432,7 @@
         <w:rPr>
           <w:sz w:val="22"/>
         </w:rPr>
-        <w:t>Cost optimisation sits at the intersection of two things I find genuinely interesting: mathematical optimisation and systems design. Framing an agent's execution as a graph and then solving a model-selection problem over it is a clean, well-defined problem. It is also practically useful right now, not in some hypothetical future.</w:t>
+        <w:t>Cost optimisation sits at the intersection of two things I find genuinely interesting: mathematical optimisation and systems design. Framing an agent's execution as a graph and solving a model-selection problem over it is a clean, well-defined problem. It is also practically useful right now, not in some hypothetical future.</w:t>
       </w:r>
     </w:p>
     <w:p>
@@ -448,7 +443,7 @@
         <w:rPr>
           <w:sz w:val="22"/>
         </w:rPr>
-        <w:t>What I built is a starting point. The greedy heuristic works, but a proper mixed-integer program — one that accounts for quality propagation between calls, uncertainty in token counts, and cross-provider latency tradeoffs — would be significantly more powerful. That is the direction I want to take this.</w:t>
+        <w:t>What I built is a starting point. The greedy heuristic works, but a proper mixed-integer programme — one that accounts for quality propagation between calls, uncertainty in token counts, and cross-provider latency tradeoffs — would be significantly more powerful. That is the direction I want to take this.</w:t>
       </w:r>
     </w:p>
     <w:sectPr>

</xml_diff>